<commit_message>
Restore previously accepted procurement Word template without changing application code
</commit_message>
<xml_diff>
--- a/procurement-template13.docx
+++ b/procurement-template13.docx
@@ -19,7 +19,7 @@
         <w:pStyle w:val="NoSpacing"/>
         <w:jc w:val="center"/>
         <w:rPr>
-          <w:rFonts w:ascii="TH SarabunPSK" w:hAnsi="TH SarabunPSK" w:cs="TH SarabunPSK"/>
+          <w:rFonts w:ascii="TH SarabunPSK" w:hAnsi="TH SarabunPSK" w:cs="TH SarabunPSK" w:hint="cs"/>
           <w:b/>
           <w:bCs/>
           <w:color w:val="000000" w:themeColor="text1"/>
@@ -206,25 +206,7 @@
           <w:sz w:val="32"/>
           <w:szCs w:val="32"/>
         </w:rPr>
-        <w:t>{{</w:t>
-      </w:r>
-      <w:proofErr w:type="spellStart"/>
-      <w:r>
-        <w:rPr>
-          <w:rFonts w:ascii="TH SarabunPSK" w:hAnsi="TH SarabunPSK" w:cs="TH SarabunPSK"/>
-          <w:sz w:val="32"/>
-          <w:szCs w:val="32"/>
-        </w:rPr>
-        <w:t>document_date</w:t>
-      </w:r>
-      <w:proofErr w:type="spellEnd"/>
-      <w:r>
-        <w:rPr>
-          <w:rFonts w:ascii="TH SarabunPSK" w:hAnsi="TH SarabunPSK" w:cs="TH SarabunPSK"/>
-          <w:sz w:val="32"/>
-          <w:szCs w:val="32"/>
-        </w:rPr>
-        <w:t>}}</w:t>
+        <w:t>{{document_date}}</w:t>
       </w:r>
       <w:r>
         <w:rPr>
@@ -297,25 +279,7 @@
           <w:sz w:val="32"/>
           <w:szCs w:val="32"/>
         </w:rPr>
-        <w:t>{{</w:t>
-      </w:r>
-      <w:proofErr w:type="spellStart"/>
-      <w:r>
-        <w:rPr>
-          <w:rFonts w:ascii="TH SarabunPSK" w:hAnsi="TH SarabunPSK" w:cs="TH SarabunPSK"/>
-          <w:sz w:val="32"/>
-          <w:szCs w:val="32"/>
-        </w:rPr>
-        <w:t>main_date</w:t>
-      </w:r>
-      <w:proofErr w:type="spellEnd"/>
-      <w:r>
-        <w:rPr>
-          <w:rFonts w:ascii="TH SarabunPSK" w:hAnsi="TH SarabunPSK" w:cs="TH SarabunPSK"/>
-          <w:sz w:val="32"/>
-          <w:szCs w:val="32"/>
-        </w:rPr>
-        <w:t>}}</w:t>
+        <w:t>{{main_date}}</w:t>
       </w:r>
     </w:p>
     <w:p>
@@ -432,7 +396,7 @@
         <w:pStyle w:val="NoSpacing"/>
         <w:spacing w:before="240"/>
         <w:rPr>
-          <w:rFonts w:ascii="TH SarabunPSK" w:hAnsi="TH SarabunPSK" w:cs="TH SarabunPSK"/>
+          <w:rFonts w:ascii="TH SarabunPSK" w:hAnsi="TH SarabunPSK" w:cs="TH SarabunPSK" w:hint="cs"/>
           <w:sz w:val="32"/>
           <w:szCs w:val="32"/>
           <w:cs/>
@@ -879,14 +843,16 @@
         <w:tab/>
         <w:t>ดังนั้นเพื่อให้การจัดทำรายละเอียดคุณลักษณะพัสดุที่จะจัดซื้อ/จัดจ้างของงานดังกล่าว เป็นไปตามระเบียบกระทรวงการคลังว่าด้วยการจัดซื้อจัดจ้างและการบริหารพัสดุภาครัฐ พ.ศ.2560 ข้อ 21 จึงเห็นสมควรมอบหมาย</w:t>
       </w:r>
-      <w:r>
-        <w:rPr>
-          <w:rFonts w:ascii="TH SarabunPSK" w:hAnsi="TH SarabunPSK" w:cs="TH SarabunPSK"/>
-          <w:sz w:val="32"/>
-          <w:szCs w:val="32"/>
-        </w:rPr>
-        <w:t xml:space="preserve"> </w:t>
-      </w:r>
+    </w:p>
+    <w:p>
+      <w:pPr>
+        <w:pStyle w:val="NoSpacing"/>
+        <w:rPr>
+          <w:rFonts w:ascii="TH SarabunPSK" w:hAnsi="TH SarabunPSK" w:cs="TH SarabunPSK"/>
+          <w:sz w:val="32"/>
+          <w:szCs w:val="32"/>
+        </w:rPr>
+      </w:pPr>
       <w:r>
         <w:rPr>
           <w:rFonts w:ascii="TH SarabunPSK" w:hAnsi="TH SarabunPSK" w:cs="TH SarabunPSK"/>
@@ -902,7 +868,7 @@
           <w:sz w:val="32"/>
           <w:szCs w:val="32"/>
         </w:rPr>
-        <w:t>assigned_officer_name</w:t>
+        <w:t>chief_officer_signer_name</w:t>
       </w:r>
       <w:proofErr w:type="spellEnd"/>
       <w:r>
@@ -1763,25 +1729,7 @@
           <w:sz w:val="32"/>
           <w:szCs w:val="32"/>
         </w:rPr>
-        <w:t>{{</w:t>
-      </w:r>
-      <w:proofErr w:type="spellStart"/>
-      <w:r>
-        <w:rPr>
-          <w:rFonts w:ascii="TH SarabunPSK" w:hAnsi="TH SarabunPSK" w:cs="TH SarabunPSK"/>
-          <w:sz w:val="32"/>
-          <w:szCs w:val="32"/>
-        </w:rPr>
-        <w:t>main_date</w:t>
-      </w:r>
-      <w:proofErr w:type="spellEnd"/>
-      <w:r>
-        <w:rPr>
-          <w:rFonts w:ascii="TH SarabunPSK" w:hAnsi="TH SarabunPSK" w:cs="TH SarabunPSK"/>
-          <w:sz w:val="32"/>
-          <w:szCs w:val="32"/>
-        </w:rPr>
-        <w:t>}}</w:t>
+        <w:t>{{main_date}}</w:t>
       </w:r>
     </w:p>
     <w:p>
@@ -1906,26 +1854,6 @@
         <w:pStyle w:val="NoSpacing"/>
         <w:rPr>
           <w:rFonts w:ascii="TH SarabunPSK" w:hAnsi="TH SarabunPSK" w:cs="TH SarabunPSK"/>
-          <w:sz w:val="32"/>
-          <w:szCs w:val="32"/>
-        </w:rPr>
-      </w:pPr>
-    </w:p>
-    <w:p>
-      <w:pPr>
-        <w:pStyle w:val="NoSpacing"/>
-        <w:rPr>
-          <w:rFonts w:ascii="TH SarabunPSK" w:hAnsi="TH SarabunPSK" w:cs="TH SarabunPSK"/>
-          <w:sz w:val="32"/>
-          <w:szCs w:val="32"/>
-        </w:rPr>
-      </w:pPr>
-    </w:p>
-    <w:p>
-      <w:pPr>
-        <w:pStyle w:val="NoSpacing"/>
-        <w:rPr>
-          <w:rFonts w:ascii="TH SarabunPSK" w:hAnsi="TH SarabunPSK" w:cs="TH SarabunPSK" w:hint="cs"/>
           <w:sz w:val="32"/>
           <w:szCs w:val="32"/>
         </w:rPr>
@@ -1974,6 +1902,7 @@
           <w:sz w:val="50"/>
           <w:szCs w:val="50"/>
         </w:rPr>
+        <w:lastRenderedPageBreak/>
         <w:drawing>
           <wp:anchor distT="0" distB="0" distL="114300" distR="114300" simplePos="0" relativeHeight="251710464" behindDoc="0" locked="0" layoutInCell="1" allowOverlap="1" wp14:anchorId="5527316E" wp14:editId="5BA02F03">
             <wp:simplePos x="0" y="0"/>
@@ -2269,9 +2198,6 @@
     <w:p>
       <w:pPr>
         <w:pStyle w:val="NoSpacing"/>
-        <w:pBdr>
-          <w:bottom w:val="single" w:sz="4" w:space="1" w:color="auto"/>
-        </w:pBdr>
         <w:rPr>
           <w:rFonts w:ascii="TH SarabunPSK" w:hAnsi="TH SarabunPSK" w:cs="TH SarabunPSK"/>
           <w:sz w:val="32"/>
@@ -2305,12 +2231,19 @@
         <w:pStyle w:val="NoSpacing"/>
         <w:rPr>
           <w:rFonts w:ascii="TH SarabunPSK" w:hAnsi="TH SarabunPSK" w:cs="TH SarabunPSK"/>
-          <w:b/>
-          <w:bCs/>
-          <w:sz w:val="32"/>
-          <w:szCs w:val="32"/>
-        </w:rPr>
-      </w:pPr>
+          <w:sz w:val="32"/>
+          <w:szCs w:val="32"/>
+        </w:rPr>
+      </w:pPr>
+      <w:r>
+        <w:rPr>
+          <w:rFonts w:ascii="TH SarabunPSK" w:hAnsi="TH SarabunPSK" w:cs="TH SarabunPSK" w:hint="cs"/>
+          <w:sz w:val="32"/>
+          <w:szCs w:val="32"/>
+          <w:cs/>
+        </w:rPr>
+        <w:t>-----------------------------------------------------------------------------------------------------------------------------------</w:t>
+      </w:r>
     </w:p>
     <w:p>
       <w:pPr>
@@ -3651,25 +3584,7 @@
           <w:sz w:val="32"/>
           <w:szCs w:val="32"/>
         </w:rPr>
-        <w:t>{{</w:t>
-      </w:r>
-      <w:proofErr w:type="spellStart"/>
-      <w:r>
-        <w:rPr>
-          <w:rFonts w:ascii="TH SarabunPSK" w:hAnsi="TH SarabunPSK" w:cs="TH SarabunPSK"/>
-          <w:sz w:val="32"/>
-          <w:szCs w:val="32"/>
-        </w:rPr>
-        <w:t>main_date</w:t>
-      </w:r>
-      <w:proofErr w:type="spellEnd"/>
-      <w:r>
-        <w:rPr>
-          <w:rFonts w:ascii="TH SarabunPSK" w:hAnsi="TH SarabunPSK" w:cs="TH SarabunPSK"/>
-          <w:sz w:val="32"/>
-          <w:szCs w:val="32"/>
-        </w:rPr>
-        <w:t>}}</w:t>
+        <w:t>{{main_date}}</w:t>
       </w:r>
     </w:p>
     <w:p>
@@ -3768,6 +3683,7 @@
           <w:szCs w:val="32"/>
           <w:cs/>
         </w:rPr>
+        <w:lastRenderedPageBreak/>
         <w:t>ขอบเขตของงานหรือรายละเอียดคุณลักษณะเฉพาะของพัสดุ</w:t>
       </w:r>
     </w:p>
@@ -3917,13 +3833,11 @@
     <w:p>
       <w:pPr>
         <w:pStyle w:val="NoSpacing"/>
-        <w:pBdr>
-          <w:bottom w:val="single" w:sz="4" w:space="1" w:color="auto"/>
-        </w:pBdr>
-        <w:rPr>
-          <w:rFonts w:ascii="TH SarabunPSK" w:hAnsi="TH SarabunPSK" w:cs="TH SarabunPSK"/>
-          <w:sz w:val="32"/>
-          <w:szCs w:val="32"/>
+        <w:rPr>
+          <w:rFonts w:ascii="TH SarabunPSK" w:hAnsi="TH SarabunPSK" w:cs="TH SarabunPSK"/>
+          <w:sz w:val="32"/>
+          <w:szCs w:val="32"/>
+          <w:cs/>
         </w:rPr>
       </w:pPr>
       <w:r>
@@ -4056,6 +3970,26 @@
           <w:cs/>
         </w:rPr>
         <w:t>งาน</w:t>
+      </w:r>
+    </w:p>
+    <w:p>
+      <w:pPr>
+        <w:pStyle w:val="NoSpacing"/>
+        <w:jc w:val="center"/>
+        <w:rPr>
+          <w:rFonts w:ascii="TH SarabunPSK" w:hAnsi="TH SarabunPSK" w:cs="TH SarabunPSK"/>
+          <w:sz w:val="32"/>
+          <w:szCs w:val="32"/>
+        </w:rPr>
+      </w:pPr>
+      <w:r>
+        <w:rPr>
+          <w:rFonts w:ascii="TH SarabunPSK" w:hAnsi="TH SarabunPSK" w:cs="TH SarabunPSK" w:hint="cs"/>
+          <w:sz w:val="32"/>
+          <w:szCs w:val="32"/>
+          <w:cs/>
+        </w:rPr>
+        <w:t>----------------------------------------------------------------</w:t>
       </w:r>
     </w:p>
     <w:p>
@@ -6791,16 +6725,6 @@
     </w:p>
     <w:p>
       <w:pPr>
-        <w:pStyle w:val="NoSpacing"/>
-        <w:rPr>
-          <w:rFonts w:ascii="TH SarabunPSK" w:hAnsi="TH SarabunPSK" w:cs="TH SarabunPSK"/>
-          <w:sz w:val="32"/>
-          <w:szCs w:val="32"/>
-        </w:rPr>
-      </w:pPr>
-    </w:p>
-    <w:p>
-      <w:pPr>
         <w:spacing w:line="216" w:lineRule="auto"/>
         <w:ind w:right="-284"/>
         <w:rPr>
@@ -6831,6 +6755,7 @@
           <w:rFonts w:ascii="TH SarabunPSK" w:hAnsi="TH SarabunPSK" w:cs="TH SarabunPSK" w:hint="cs"/>
           <w:noProof/>
         </w:rPr>
+        <w:lastRenderedPageBreak/>
         <w:drawing>
           <wp:anchor distT="0" distB="0" distL="114300" distR="114300" simplePos="0" relativeHeight="251671552" behindDoc="0" locked="0" layoutInCell="1" allowOverlap="1" wp14:anchorId="2B386F11" wp14:editId="2F09A503">
             <wp:simplePos x="0" y="0"/>
@@ -7140,6 +7065,7 @@
           <w:rFonts w:ascii="TH SarabunPSK" w:hAnsi="TH SarabunPSK" w:cs="TH SarabunPSK"/>
           <w:sz w:val="30"/>
           <w:szCs w:val="30"/>
+          <w:cs/>
         </w:rPr>
       </w:pPr>
       <w:r>
@@ -7235,21 +7161,7 @@
         <w:rPr>
           <w:rFonts w:ascii="TH SarabunPSK" w:hAnsi="TH SarabunPSK" w:cs="TH SarabunPSK"/>
         </w:rPr>
-        <w:t>{{</w:t>
-      </w:r>
-      <w:proofErr w:type="spellStart"/>
-      <w:r>
-        <w:rPr>
-          <w:rFonts w:ascii="TH SarabunPSK" w:hAnsi="TH SarabunPSK" w:cs="TH SarabunPSK"/>
-        </w:rPr>
-        <w:t>requesting_unit</w:t>
-      </w:r>
-      <w:proofErr w:type="spellEnd"/>
-      <w:r>
-        <w:rPr>
-          <w:rFonts w:ascii="TH SarabunPSK" w:hAnsi="TH SarabunPSK" w:cs="TH SarabunPSK"/>
-        </w:rPr>
-        <w:t>}}</w:t>
+        <w:t>{{requesting_unit}}</w:t>
       </w:r>
       <w:r>
         <w:rPr>
@@ -8049,7 +7961,7 @@
         <w:rPr>
           <w:rFonts w:ascii="TH SarabunPSK" w:hAnsi="TH SarabunPSK" w:cs="TH SarabunPSK"/>
         </w:rPr>
-        <w:t>inspector_name</w:t>
+        <w:t>assigned_officer_name</w:t>
       </w:r>
       <w:proofErr w:type="spellEnd"/>
       <w:r>
@@ -8697,27 +8609,14 @@
           <w:rFonts w:ascii="TH SarabunPSK" w:hAnsi="TH SarabunPSK" w:cs="TH SarabunPSK" w:hint="cs"/>
           <w:cs/>
         </w:rPr>
+        <w:lastRenderedPageBreak/>
         <w:t xml:space="preserve">รายละเอียดแนบท้ายบันทึกข้อความ ที่ </w:t>
       </w:r>
       <w:r>
         <w:rPr>
           <w:rFonts w:ascii="TH SarabunPSK" w:hAnsi="TH SarabunPSK" w:cs="TH SarabunPSK"/>
         </w:rPr>
-        <w:t>{{</w:t>
-      </w:r>
-      <w:proofErr w:type="spellStart"/>
-      <w:r>
-        <w:rPr>
-          <w:rFonts w:ascii="TH SarabunPSK" w:hAnsi="TH SarabunPSK" w:cs="TH SarabunPSK"/>
-        </w:rPr>
-        <w:t>document_date</w:t>
-      </w:r>
-      <w:proofErr w:type="spellEnd"/>
-      <w:r>
-        <w:rPr>
-          <w:rFonts w:ascii="TH SarabunPSK" w:hAnsi="TH SarabunPSK" w:cs="TH SarabunPSK"/>
-        </w:rPr>
-        <w:t>}}</w:t>
+        <w:t>{{document_date}}</w:t>
       </w:r>
       <w:r>
         <w:rPr>
@@ -8730,21 +8629,7 @@
         <w:rPr>
           <w:rFonts w:ascii="TH SarabunPSK" w:hAnsi="TH SarabunPSK" w:cs="TH SarabunPSK"/>
         </w:rPr>
-        <w:t>{{</w:t>
-      </w:r>
-      <w:proofErr w:type="spellStart"/>
-      <w:r>
-        <w:rPr>
-          <w:rFonts w:ascii="TH SarabunPSK" w:hAnsi="TH SarabunPSK" w:cs="TH SarabunPSK"/>
-        </w:rPr>
-        <w:t>main_date</w:t>
-      </w:r>
-      <w:proofErr w:type="spellEnd"/>
-      <w:r>
-        <w:rPr>
-          <w:rFonts w:ascii="TH SarabunPSK" w:hAnsi="TH SarabunPSK" w:cs="TH SarabunPSK"/>
-        </w:rPr>
-        <w:t>}}</w:t>
+        <w:t>{{main_date}}</w:t>
       </w:r>
     </w:p>
     <w:p>
@@ -9701,21 +9586,7 @@
         <w:rPr>
           <w:rFonts w:ascii="TH SarabunPSK" w:hAnsi="TH SarabunPSK" w:cs="TH SarabunPSK"/>
         </w:rPr>
-        <w:t>{{</w:t>
-      </w:r>
-      <w:proofErr w:type="spellStart"/>
-      <w:r>
-        <w:rPr>
-          <w:rFonts w:ascii="TH SarabunPSK" w:hAnsi="TH SarabunPSK" w:cs="TH SarabunPSK"/>
-        </w:rPr>
-        <w:t>main_date</w:t>
-      </w:r>
-      <w:proofErr w:type="spellEnd"/>
-      <w:r>
-        <w:rPr>
-          <w:rFonts w:ascii="TH SarabunPSK" w:hAnsi="TH SarabunPSK" w:cs="TH SarabunPSK"/>
-        </w:rPr>
-        <w:t>}}</w:t>
+        <w:t>{{main_date}}</w:t>
       </w:r>
     </w:p>
     <w:p>
@@ -9994,6 +9865,7 @@
           <w:sz w:val="48"/>
           <w:szCs w:val="48"/>
         </w:rPr>
+        <w:lastRenderedPageBreak/>
         <w:drawing>
           <wp:anchor distT="0" distB="0" distL="114300" distR="114300" simplePos="0" relativeHeight="251686912" behindDoc="0" locked="0" layoutInCell="1" allowOverlap="1" wp14:anchorId="179D528B" wp14:editId="09745772">
             <wp:simplePos x="0" y="0"/>
@@ -10156,25 +10028,7 @@
           <w:sz w:val="32"/>
           <w:szCs w:val="32"/>
         </w:rPr>
-        <w:t>{{</w:t>
-      </w:r>
-      <w:proofErr w:type="spellStart"/>
-      <w:r>
-        <w:rPr>
-          <w:rFonts w:ascii="TH SarabunPSK" w:hAnsi="TH SarabunPSK" w:cs="TH SarabunPSK"/>
-          <w:sz w:val="32"/>
-          <w:szCs w:val="32"/>
-        </w:rPr>
-        <w:t>document_date</w:t>
-      </w:r>
-      <w:proofErr w:type="spellEnd"/>
-      <w:r>
-        <w:rPr>
-          <w:rFonts w:ascii="TH SarabunPSK" w:hAnsi="TH SarabunPSK" w:cs="TH SarabunPSK"/>
-          <w:sz w:val="32"/>
-          <w:szCs w:val="32"/>
-        </w:rPr>
-        <w:t>}}</w:t>
+        <w:t>{{document_date}}</w:t>
       </w:r>
       <w:r>
         <w:rPr>
@@ -10247,25 +10101,7 @@
           <w:sz w:val="32"/>
           <w:szCs w:val="32"/>
         </w:rPr>
-        <w:t>{{</w:t>
-      </w:r>
-      <w:proofErr w:type="spellStart"/>
-      <w:r>
-        <w:rPr>
-          <w:rFonts w:ascii="TH SarabunPSK" w:hAnsi="TH SarabunPSK" w:cs="TH SarabunPSK"/>
-          <w:sz w:val="32"/>
-          <w:szCs w:val="32"/>
-        </w:rPr>
-        <w:t>main_date</w:t>
-      </w:r>
-      <w:proofErr w:type="spellEnd"/>
-      <w:r>
-        <w:rPr>
-          <w:rFonts w:ascii="TH SarabunPSK" w:hAnsi="TH SarabunPSK" w:cs="TH SarabunPSK"/>
-          <w:sz w:val="32"/>
-          <w:szCs w:val="32"/>
-        </w:rPr>
-        <w:t>}}</w:t>
+        <w:t>{{main_date}}</w:t>
       </w:r>
     </w:p>
     <w:p>
@@ -11734,10 +11570,38 @@
       <w:pPr>
         <w:jc w:val="center"/>
         <w:rPr>
+          <w:rFonts w:ascii="TH SarabunPSK" w:eastAsia="Calibri" w:hAnsi="TH SarabunPSK" w:cs="TH SarabunPSK" w:hint="cs"/>
+          <w:b/>
+          <w:bCs/>
+          <w:cs/>
+        </w:rPr>
+      </w:pPr>
+      <w:r>
+        <w:rPr>
+          <w:rFonts w:ascii="TH SarabunPSK" w:eastAsia="Calibri" w:hAnsi="TH SarabunPSK" w:cs="TH SarabunPSK" w:hint="cs"/>
+          <w:b/>
+          <w:bCs/>
+          <w:cs/>
+        </w:rPr>
+        <w:t>ประกาศโรงเรียน</w:t>
+      </w:r>
+      <w:r>
+        <w:rPr>
+          <w:rFonts w:ascii="TH SarabunPSK" w:eastAsia="Calibri" w:hAnsi="TH SarabunPSK" w:cs="TH SarabunPSK" w:hint="cs"/>
+          <w:b/>
+          <w:bCs/>
+          <w:cs/>
+        </w:rPr>
+        <w:t>ค่ายบางระจันวิทยาคม</w:t>
+      </w:r>
+    </w:p>
+    <w:p>
+      <w:pPr>
+        <w:jc w:val="center"/>
+        <w:rPr>
           <w:rFonts w:ascii="TH SarabunPSK" w:eastAsia="Calibri" w:hAnsi="TH SarabunPSK" w:cs="TH SarabunPSK"/>
           <w:b/>
           <w:bCs/>
-          <w:cs/>
         </w:rPr>
       </w:pPr>
       <w:r>
@@ -11747,7 +11611,7 @@
           <w:bCs/>
           <w:cs/>
         </w:rPr>
-        <w:t>ประกาศโรงเรียน</w:t>
+        <w:t>เรื่อง   ประกาศผู้ชนะการเสนอราคาสำหรับการจัดซื้อ/จัดจ้าง</w:t>
       </w:r>
       <w:r>
         <w:rPr>
@@ -11756,72 +11620,43 @@
           <w:bCs/>
           <w:cs/>
         </w:rPr>
-        <w:t>ค่ายบางระจันวิทยาคม</w:t>
-      </w:r>
-    </w:p>
-    <w:p>
-      <w:pPr>
-        <w:pBdr>
-          <w:bottom w:val="single" w:sz="4" w:space="1" w:color="auto"/>
-        </w:pBdr>
+        <w:t xml:space="preserve"> </w:t>
+      </w:r>
+      <w:r>
+        <w:rPr>
+          <w:rFonts w:ascii="TH SarabunPSK" w:hAnsi="TH SarabunPSK" w:cs="TH SarabunPSK"/>
+        </w:rPr>
+        <w:t>{{</w:t>
+      </w:r>
+      <w:proofErr w:type="spellStart"/>
+      <w:r>
+        <w:rPr>
+          <w:rFonts w:ascii="TH SarabunPSK" w:hAnsi="TH SarabunPSK" w:cs="TH SarabunPSK"/>
+        </w:rPr>
+        <w:t>procurement_description</w:t>
+      </w:r>
+      <w:proofErr w:type="spellEnd"/>
+      <w:r>
+        <w:rPr>
+          <w:rFonts w:ascii="TH SarabunPSK" w:hAnsi="TH SarabunPSK" w:cs="TH SarabunPSK"/>
+        </w:rPr>
+        <w:t>}}</w:t>
+      </w:r>
+    </w:p>
+    <w:p>
+      <w:pPr>
         <w:jc w:val="center"/>
         <w:rPr>
           <w:rFonts w:ascii="TH SarabunPSK" w:eastAsia="Calibri" w:hAnsi="TH SarabunPSK" w:cs="TH SarabunPSK"/>
-          <w:b/>
-          <w:bCs/>
         </w:rPr>
       </w:pPr>
       <w:r>
         <w:rPr>
           <w:rFonts w:ascii="TH SarabunPSK" w:eastAsia="Calibri" w:hAnsi="TH SarabunPSK" w:cs="TH SarabunPSK" w:hint="cs"/>
-          <w:b/>
-          <w:bCs/>
-          <w:cs/>
-        </w:rPr>
-        <w:t>เรื่อง   ประกาศผู้ชนะการเสนอราคาสำหรับการจัดซื้อ/จัดจ้าง</w:t>
-      </w:r>
-      <w:r>
-        <w:rPr>
-          <w:rFonts w:ascii="TH SarabunPSK" w:eastAsia="Calibri" w:hAnsi="TH SarabunPSK" w:cs="TH SarabunPSK" w:hint="cs"/>
-          <w:b/>
-          <w:bCs/>
-          <w:cs/>
-        </w:rPr>
-        <w:t xml:space="preserve"> </w:t>
-      </w:r>
-      <w:r>
-        <w:rPr>
-          <w:rFonts w:ascii="TH SarabunPSK" w:hAnsi="TH SarabunPSK" w:cs="TH SarabunPSK"/>
-        </w:rPr>
-        <w:t>{{</w:t>
-      </w:r>
-      <w:proofErr w:type="spellStart"/>
-      <w:r>
-        <w:rPr>
-          <w:rFonts w:ascii="TH SarabunPSK" w:hAnsi="TH SarabunPSK" w:cs="TH SarabunPSK"/>
-        </w:rPr>
-        <w:t>procurement_description</w:t>
-      </w:r>
-      <w:proofErr w:type="spellEnd"/>
-      <w:r>
-        <w:rPr>
-          <w:rFonts w:ascii="TH SarabunPSK" w:hAnsi="TH SarabunPSK" w:cs="TH SarabunPSK"/>
-        </w:rPr>
-        <w:t>}}</w:t>
-      </w:r>
-    </w:p>
-    <w:p>
-      <w:pPr>
-        <w:pBdr>
-          <w:bottom w:val="single" w:sz="4" w:space="1" w:color="auto"/>
-        </w:pBdr>
-        <w:jc w:val="center"/>
-        <w:rPr>
-          <w:rFonts w:ascii="TH SarabunPSK" w:eastAsia="Calibri" w:hAnsi="TH SarabunPSK" w:cs="TH SarabunPSK"/>
-          <w:b/>
-          <w:bCs/>
-        </w:rPr>
-      </w:pPr>
+          <w:cs/>
+        </w:rPr>
+        <w:t>--------------------------------------------------------------</w:t>
+      </w:r>
     </w:p>
     <w:p>
       <w:pPr>
@@ -12542,6 +12377,7 @@
           <w:szCs w:val="48"/>
           <w:cs/>
         </w:rPr>
+        <w:lastRenderedPageBreak/>
         <w:t>ใบตรวจรับพัสดุ</w:t>
       </w:r>
     </w:p>
@@ -13485,14 +13321,7 @@
           <w:cs/>
         </w:rPr>
         <w:tab/>
-        <w:t xml:space="preserve">      </w:t>
-      </w:r>
-      <w:r>
-        <w:rPr>
-          <w:rFonts w:ascii="TH SarabunPSK" w:hAnsi="TH SarabunPSK" w:cs="TH SarabunPSK" w:hint="cs"/>
-          <w:cs/>
-        </w:rPr>
-        <w:t xml:space="preserve"> (</w:t>
+        <w:t xml:space="preserve">       (</w:t>
       </w:r>
       <w:r>
         <w:rPr>
@@ -13505,7 +13334,7 @@
         <w:rPr>
           <w:rFonts w:ascii="TH SarabunPSK" w:hAnsi="TH SarabunPSK" w:cs="TH SarabunPSK"/>
         </w:rPr>
-        <w:t>inspector_name</w:t>
+        <w:t>assigned_officer_name</w:t>
       </w:r>
       <w:proofErr w:type="spellEnd"/>
       <w:r>
@@ -14186,6 +14015,7 @@
           <w:sz w:val="32"/>
           <w:szCs w:val="32"/>
         </w:rPr>
+        <w:lastRenderedPageBreak/>
         <w:drawing>
           <wp:anchor distT="0" distB="0" distL="114300" distR="114300" simplePos="0" relativeHeight="251713536" behindDoc="0" locked="0" layoutInCell="1" allowOverlap="1" wp14:anchorId="127B3C45" wp14:editId="1CC3D3EC">
             <wp:simplePos x="0" y="0"/>
@@ -14365,25 +14195,7 @@
           <w:sz w:val="32"/>
           <w:szCs w:val="32"/>
         </w:rPr>
-        <w:t>{{</w:t>
-      </w:r>
-      <w:proofErr w:type="spellStart"/>
-      <w:r>
-        <w:rPr>
-          <w:rFonts w:ascii="TH SarabunPSK" w:hAnsi="TH SarabunPSK" w:cs="TH SarabunPSK"/>
-          <w:sz w:val="32"/>
-          <w:szCs w:val="32"/>
-        </w:rPr>
-        <w:t>document_date</w:t>
-      </w:r>
-      <w:proofErr w:type="spellEnd"/>
-      <w:r>
-        <w:rPr>
-          <w:rFonts w:ascii="TH SarabunPSK" w:hAnsi="TH SarabunPSK" w:cs="TH SarabunPSK"/>
-          <w:sz w:val="32"/>
-          <w:szCs w:val="32"/>
-        </w:rPr>
-        <w:t>}}</w:t>
+        <w:t>{{document_date}}</w:t>
       </w:r>
       <w:r>
         <w:rPr>
@@ -14480,13 +14292,11 @@
     <w:p>
       <w:pPr>
         <w:pStyle w:val="NoSpacing"/>
-        <w:pBdr>
-          <w:bottom w:val="single" w:sz="4" w:space="1" w:color="auto"/>
-        </w:pBdr>
-        <w:rPr>
-          <w:rFonts w:ascii="TH SarabunPSK" w:hAnsi="TH SarabunPSK" w:cs="TH SarabunPSK"/>
-          <w:sz w:val="32"/>
-          <w:szCs w:val="32"/>
+        <w:rPr>
+          <w:rFonts w:ascii="TH SarabunPSK" w:hAnsi="TH SarabunPSK" w:cs="TH SarabunPSK"/>
+          <w:sz w:val="32"/>
+          <w:szCs w:val="32"/>
+          <w:cs/>
         </w:rPr>
       </w:pPr>
       <w:r>
@@ -14515,12 +14325,19 @@
         <w:pStyle w:val="NoSpacing"/>
         <w:rPr>
           <w:rFonts w:ascii="TH SarabunPSK" w:hAnsi="TH SarabunPSK" w:cs="TH SarabunPSK"/>
-          <w:b/>
-          <w:bCs/>
-          <w:sz w:val="32"/>
-          <w:szCs w:val="32"/>
-        </w:rPr>
-      </w:pPr>
+          <w:sz w:val="32"/>
+          <w:szCs w:val="32"/>
+        </w:rPr>
+      </w:pPr>
+      <w:r>
+        <w:rPr>
+          <w:rFonts w:ascii="TH SarabunPSK" w:hAnsi="TH SarabunPSK" w:cs="TH SarabunPSK" w:hint="cs"/>
+          <w:sz w:val="32"/>
+          <w:szCs w:val="32"/>
+          <w:cs/>
+        </w:rPr>
+        <w:t>-----------------------------------------------------------------------------------------------------------------------------------</w:t>
+      </w:r>
     </w:p>
     <w:p>
       <w:pPr>
@@ -14676,25 +14493,7 @@
           <w:sz w:val="32"/>
           <w:szCs w:val="32"/>
         </w:rPr>
-        <w:t>{{</w:t>
-      </w:r>
-      <w:proofErr w:type="spellStart"/>
-      <w:r>
-        <w:rPr>
-          <w:rFonts w:ascii="TH SarabunPSK" w:hAnsi="TH SarabunPSK" w:cs="TH SarabunPSK"/>
-          <w:sz w:val="32"/>
-          <w:szCs w:val="32"/>
-        </w:rPr>
-        <w:t>requesting_unit</w:t>
-      </w:r>
-      <w:proofErr w:type="spellEnd"/>
-      <w:r>
-        <w:rPr>
-          <w:rFonts w:ascii="TH SarabunPSK" w:hAnsi="TH SarabunPSK" w:cs="TH SarabunPSK"/>
-          <w:sz w:val="32"/>
-          <w:szCs w:val="32"/>
-        </w:rPr>
-        <w:t>}}</w:t>
+        <w:t>{{requesting_unit}}</w:t>
       </w:r>
       <w:r>
         <w:rPr>
@@ -16668,70 +16467,13 @@
         <w:tabs>
           <w:tab w:val="center" w:pos="2268"/>
         </w:tabs>
-        <w:rPr>
-          <w:rFonts w:ascii="TH SarabunPSK" w:hAnsi="TH SarabunPSK" w:cs="TH SarabunPSK" w:hint="cs"/>
+        <w:jc w:val="center"/>
+        <w:rPr>
+          <w:rFonts w:ascii="TH SarabunPSK" w:hAnsi="TH SarabunPSK" w:cs="TH SarabunPSK"/>
           <w:b/>
           <w:bCs/>
         </w:rPr>
       </w:pPr>
-    </w:p>
-    <w:p>
-      <w:pPr>
-        <w:tabs>
-          <w:tab w:val="center" w:pos="2268"/>
-        </w:tabs>
-        <w:rPr>
-          <w:rFonts w:ascii="TH SarabunPSK" w:hAnsi="TH SarabunPSK" w:cs="TH SarabunPSK"/>
-          <w:b/>
-          <w:bCs/>
-          <w:cs/>
-        </w:rPr>
-      </w:pPr>
-      <w:r>
-        <w:rPr>
-          <w:rFonts w:ascii="TH SarabunPSK" w:hAnsi="TH SarabunPSK" w:cs="TH SarabunPSK"/>
-          <w:b/>
-          <w:bCs/>
-          <w:cs/>
-        </w:rPr>
-        <w:tab/>
-      </w:r>
-      <w:r>
-        <w:rPr>
-          <w:rFonts w:ascii="TH SarabunPSK" w:hAnsi="TH SarabunPSK" w:cs="TH SarabunPSK"/>
-          <w:b/>
-          <w:bCs/>
-          <w:cs/>
-        </w:rPr>
-        <w:tab/>
-      </w:r>
-      <w:r>
-        <w:rPr>
-          <w:rFonts w:ascii="TH SarabunPSK" w:hAnsi="TH SarabunPSK" w:cs="TH SarabunPSK"/>
-          <w:b/>
-          <w:bCs/>
-          <w:cs/>
-        </w:rPr>
-        <w:tab/>
-      </w:r>
-      <w:r>
-        <w:rPr>
-          <w:rFonts w:ascii="TH SarabunPSK" w:hAnsi="TH SarabunPSK" w:cs="TH SarabunPSK"/>
-          <w:b/>
-          <w:bCs/>
-          <w:cs/>
-        </w:rPr>
-        <w:tab/>
-      </w:r>
-      <w:r>
-        <w:rPr>
-          <w:rFonts w:ascii="TH SarabunPSK" w:hAnsi="TH SarabunPSK" w:cs="TH SarabunPSK" w:hint="cs"/>
-          <w:b/>
-          <w:bCs/>
-          <w:cs/>
-        </w:rPr>
-        <w:t>ใบเบิกพัสดุ</w:t>
-      </w:r>
     </w:p>
     <w:p>
       <w:pPr>
@@ -16741,43 +16483,68 @@
         <w:jc w:val="center"/>
         <w:rPr>
           <w:rFonts w:ascii="TH SarabunPSK" w:hAnsi="TH SarabunPSK" w:cs="TH SarabunPSK"/>
-        </w:rPr>
-      </w:pPr>
-      <w:r>
-        <w:rPr>
-          <w:rFonts w:ascii="TH SarabunPSK" w:hAnsi="TH SarabunPSK" w:cs="TH SarabunPSK" w:hint="cs"/>
-          <w:cs/>
-        </w:rPr>
-        <w:tab/>
-      </w:r>
-      <w:r>
-        <w:rPr>
-          <w:rFonts w:ascii="TH SarabunPSK" w:hAnsi="TH SarabunPSK" w:cs="TH SarabunPSK" w:hint="cs"/>
-          <w:cs/>
-        </w:rPr>
-        <w:tab/>
-      </w:r>
-      <w:r>
-        <w:rPr>
-          <w:rFonts w:ascii="TH SarabunPSK" w:hAnsi="TH SarabunPSK" w:cs="TH SarabunPSK" w:hint="cs"/>
-          <w:cs/>
-        </w:rPr>
-        <w:tab/>
-      </w:r>
-      <w:r>
-        <w:rPr>
-          <w:rFonts w:ascii="TH SarabunPSK" w:hAnsi="TH SarabunPSK" w:cs="TH SarabunPSK" w:hint="cs"/>
-          <w:cs/>
-        </w:rPr>
-        <w:tab/>
-      </w:r>
-      <w:r>
-        <w:rPr>
-          <w:rFonts w:ascii="TH SarabunPSK" w:hAnsi="TH SarabunPSK" w:cs="TH SarabunPSK" w:hint="cs"/>
-          <w:cs/>
-        </w:rPr>
-        <w:tab/>
-        <w:t xml:space="preserve">     ส่วนราชการ โรงเรียนค่ายบางระจันวิทยาคม</w:t>
+          <w:b/>
+          <w:bCs/>
+        </w:rPr>
+      </w:pPr>
+    </w:p>
+    <w:p>
+      <w:pPr>
+        <w:tabs>
+          <w:tab w:val="center" w:pos="2268"/>
+        </w:tabs>
+        <w:rPr>
+          <w:rFonts w:ascii="TH SarabunPSK" w:hAnsi="TH SarabunPSK" w:cs="TH SarabunPSK"/>
+          <w:b/>
+          <w:bCs/>
+          <w:cs/>
+        </w:rPr>
+      </w:pPr>
+      <w:r>
+        <w:rPr>
+          <w:rFonts w:ascii="TH SarabunPSK" w:hAnsi="TH SarabunPSK" w:cs="TH SarabunPSK"/>
+          <w:b/>
+          <w:bCs/>
+          <w:cs/>
+        </w:rPr>
+        <w:lastRenderedPageBreak/>
+        <w:tab/>
+      </w:r>
+      <w:r>
+        <w:rPr>
+          <w:rFonts w:ascii="TH SarabunPSK" w:hAnsi="TH SarabunPSK" w:cs="TH SarabunPSK"/>
+          <w:b/>
+          <w:bCs/>
+          <w:cs/>
+        </w:rPr>
+        <w:tab/>
+      </w:r>
+      <w:r>
+        <w:rPr>
+          <w:rFonts w:ascii="TH SarabunPSK" w:hAnsi="TH SarabunPSK" w:cs="TH SarabunPSK"/>
+          <w:b/>
+          <w:bCs/>
+          <w:cs/>
+        </w:rPr>
+        <w:tab/>
+      </w:r>
+      <w:r>
+        <w:rPr>
+          <w:rFonts w:ascii="TH SarabunPSK" w:hAnsi="TH SarabunPSK" w:cs="TH SarabunPSK"/>
+          <w:b/>
+          <w:bCs/>
+          <w:cs/>
+        </w:rPr>
+        <w:tab/>
+      </w:r>
+      <w:r>
+        <w:rPr>
+          <w:rFonts w:ascii="TH SarabunPSK" w:hAnsi="TH SarabunPSK" w:cs="TH SarabunPSK" w:hint="cs"/>
+          <w:b/>
+          <w:bCs/>
+          <w:cs/>
+        </w:rPr>
+        <w:t>ใบเบิกพัสดุ</w:t>
       </w:r>
     </w:p>
     <w:p>
@@ -16788,7 +16555,53 @@
         <w:jc w:val="center"/>
         <w:rPr>
           <w:rFonts w:ascii="TH SarabunPSK" w:hAnsi="TH SarabunPSK" w:cs="TH SarabunPSK"/>
-          <w:cs/>
+        </w:rPr>
+      </w:pPr>
+      <w:r>
+        <w:rPr>
+          <w:rFonts w:ascii="TH SarabunPSK" w:hAnsi="TH SarabunPSK" w:cs="TH SarabunPSK" w:hint="cs"/>
+          <w:cs/>
+        </w:rPr>
+        <w:tab/>
+      </w:r>
+      <w:r>
+        <w:rPr>
+          <w:rFonts w:ascii="TH SarabunPSK" w:hAnsi="TH SarabunPSK" w:cs="TH SarabunPSK" w:hint="cs"/>
+          <w:cs/>
+        </w:rPr>
+        <w:tab/>
+      </w:r>
+      <w:r>
+        <w:rPr>
+          <w:rFonts w:ascii="TH SarabunPSK" w:hAnsi="TH SarabunPSK" w:cs="TH SarabunPSK" w:hint="cs"/>
+          <w:cs/>
+        </w:rPr>
+        <w:tab/>
+      </w:r>
+      <w:r>
+        <w:rPr>
+          <w:rFonts w:ascii="TH SarabunPSK" w:hAnsi="TH SarabunPSK" w:cs="TH SarabunPSK" w:hint="cs"/>
+          <w:cs/>
+        </w:rPr>
+        <w:tab/>
+      </w:r>
+      <w:r>
+        <w:rPr>
+          <w:rFonts w:ascii="TH SarabunPSK" w:hAnsi="TH SarabunPSK" w:cs="TH SarabunPSK" w:hint="cs"/>
+          <w:cs/>
+        </w:rPr>
+        <w:tab/>
+        <w:t xml:space="preserve">     ส่วนราชการ โรงเรียนค่ายบางระจันวิทยาคม</w:t>
+      </w:r>
+    </w:p>
+    <w:p>
+      <w:pPr>
+        <w:tabs>
+          <w:tab w:val="center" w:pos="2268"/>
+        </w:tabs>
+        <w:jc w:val="center"/>
+        <w:rPr>
+          <w:rFonts w:ascii="TH SarabunPSK" w:hAnsi="TH SarabunPSK" w:cs="TH SarabunPSK"/>
         </w:rPr>
       </w:pPr>
       <w:r>
@@ -16815,23 +16628,10 @@
       </w:r>
       <w:r>
         <w:rPr>
-          <w:rFonts w:ascii="TH SarabunPSK" w:hAnsi="TH SarabunPSK" w:cs="TH SarabunPSK"/>
-        </w:rPr>
-        <w:t>{{</w:t>
-      </w:r>
-      <w:proofErr w:type="spellStart"/>
-      <w:r>
-        <w:rPr>
-          <w:rFonts w:ascii="TH SarabunPSK" w:hAnsi="TH SarabunPSK" w:cs="TH SarabunPSK"/>
-        </w:rPr>
-        <w:t>inspection_date</w:t>
-      </w:r>
-      <w:proofErr w:type="spellEnd"/>
-      <w:r>
-        <w:rPr>
-          <w:rFonts w:ascii="TH SarabunPSK" w:hAnsi="TH SarabunPSK" w:cs="TH SarabunPSK"/>
-        </w:rPr>
-        <w:t>}}</w:t>
+          <w:rFonts w:ascii="TH SarabunPSK" w:hAnsi="TH SarabunPSK" w:cs="TH SarabunPSK" w:hint="cs"/>
+          <w:cs/>
+        </w:rPr>
+        <w:t>วันที่.....26....เดือน......สิงหาคม..........พ.ศ......2569.....</w:t>
       </w:r>
     </w:p>
     <w:p>
@@ -16863,21 +16663,7 @@
         <w:rPr>
           <w:rFonts w:ascii="TH SarabunPSK" w:hAnsi="TH SarabunPSK" w:cs="TH SarabunPSK"/>
         </w:rPr>
-        <w:t>{{</w:t>
-      </w:r>
-      <w:proofErr w:type="spellStart"/>
-      <w:r>
-        <w:rPr>
-          <w:rFonts w:ascii="TH SarabunPSK" w:hAnsi="TH SarabunPSK" w:cs="TH SarabunPSK"/>
-        </w:rPr>
-        <w:t>requesting_unit</w:t>
-      </w:r>
-      <w:proofErr w:type="spellEnd"/>
-      <w:r>
-        <w:rPr>
-          <w:rFonts w:ascii="TH SarabunPSK" w:hAnsi="TH SarabunPSK" w:cs="TH SarabunPSK"/>
-        </w:rPr>
-        <w:t>}}</w:t>
+        <w:t>{{requesting_unit}}</w:t>
       </w:r>
     </w:p>
     <w:tbl>
@@ -18430,50 +18216,38 @@
       </w:pPr>
       <w:r>
         <w:rPr>
-          <w:rFonts w:ascii="TH SarabunPSK" w:hAnsi="TH SarabunPSK" w:cs="TH SarabunPSK"/>
-        </w:rPr>
-        <w:tab/>
-      </w:r>
-      <w:r>
-        <w:rPr>
-          <w:rFonts w:ascii="TH SarabunPSK" w:hAnsi="TH SarabunPSK" w:cs="TH SarabunPSK"/>
-        </w:rPr>
-        <w:t>{{</w:t>
-      </w:r>
-      <w:proofErr w:type="spellStart"/>
-      <w:r>
-        <w:rPr>
-          <w:rFonts w:ascii="TH SarabunPSK" w:hAnsi="TH SarabunPSK" w:cs="TH SarabunPSK"/>
-        </w:rPr>
-        <w:t>inspection_date</w:t>
-      </w:r>
-      <w:proofErr w:type="spellEnd"/>
-      <w:r>
-        <w:rPr>
-          <w:rFonts w:ascii="TH SarabunPSK" w:hAnsi="TH SarabunPSK" w:cs="TH SarabunPSK"/>
-        </w:rPr>
-        <w:t>}}</w:t>
-      </w:r>
-      <w:r>
-        <w:rPr>
-          <w:rFonts w:ascii="TH SarabunPSK" w:hAnsi="TH SarabunPSK" w:cs="TH SarabunPSK"/>
-          <w:cs/>
-        </w:rPr>
-        <w:tab/>
-      </w:r>
-      <w:r>
-        <w:rPr>
-          <w:rFonts w:ascii="TH SarabunPSK" w:hAnsi="TH SarabunPSK" w:cs="TH SarabunPSK"/>
-          <w:cs/>
-        </w:rPr>
-        <w:tab/>
-      </w:r>
-      <w:r>
-        <w:rPr>
-          <w:rFonts w:ascii="TH SarabunPSK" w:hAnsi="TH SarabunPSK" w:cs="TH SarabunPSK" w:hint="cs"/>
-          <w:cs/>
-        </w:rPr>
-        <w:t xml:space="preserve">           </w:t>
+          <w:rFonts w:ascii="TH SarabunPSK" w:hAnsi="TH SarabunPSK" w:cs="TH SarabunPSK" w:hint="cs"/>
+          <w:cs/>
+        </w:rPr>
+        <w:t xml:space="preserve">วันที่....................เดือน..............................พ.ศ...............              </w:t>
+      </w:r>
+      <w:r>
+        <w:rPr>
+          <w:rFonts w:ascii="TH SarabunPSK" w:hAnsi="TH SarabunPSK" w:cs="TH SarabunPSK"/>
+          <w:cs/>
+        </w:rPr>
+        <w:tab/>
+      </w:r>
+      <w:r>
+        <w:rPr>
+          <w:rFonts w:ascii="TH SarabunPSK" w:hAnsi="TH SarabunPSK" w:cs="TH SarabunPSK"/>
+          <w:cs/>
+        </w:rPr>
+        <w:tab/>
+      </w:r>
+      <w:r>
+        <w:rPr>
+          <w:rFonts w:ascii="TH SarabunPSK" w:hAnsi="TH SarabunPSK" w:cs="TH SarabunPSK"/>
+          <w:cs/>
+        </w:rPr>
+        <w:tab/>
+      </w:r>
+      <w:r>
+        <w:rPr>
+          <w:rFonts w:ascii="TH SarabunPSK" w:hAnsi="TH SarabunPSK" w:cs="TH SarabunPSK" w:hint="cs"/>
+          <w:cs/>
+        </w:rPr>
+        <w:t xml:space="preserve">  </w:t>
       </w:r>
       <w:r>
         <w:rPr>

</xml_diff>